<commit_message>
정본(Dossier) 정합 업데이트 — Macro Override·닷컴 처리·V8 UNKNOWN·LLM/TSFM
- GPT 의견 대부분 일치 + Claude no-echo 개선:
  ★ Macro Emergency Override를 공격 파트만(레버/V8 shadow/Alpha Lab)+사람 게이트로 좁힘
    코어 4-sleeve 1.0x 면역(자동 코어전환=regime-switch/throttle 기각 교훈)·후행이라 첫 -25% 못 피함
- LOCK E(위기 데이터): 닷컴/2008=학습 제외 가능·리스크 검증 제외 금지(감 아니라 Override로 시스템화)
  ·2000 MF proxy 부재 caveat·전부폐기도 무시통과도 금지=UNKNOWN
- V7 닷컴 caveat(2019~ -18%는 benign·닷컴류 -39%)·V8 Candidate 항목(UNKNOWN/shadow only)
- Track1 V8 1.10~1.25x shadow forward·Track2 LLM catalyst 분류 1회·TSFM 나중 challenger
- Dossier 45KB(LOCK A~E·V4~V8·멀티앵커·트러블슈팅·3트랙)

Co-Authored-By: Claude Opus 4.8 (1M context) <noreply@anthropic.com>
</commit_message>
<xml_diff>
--- a/PRAMANA_V4/PRAMANA_Lineage_Dossier.docx
+++ b/PRAMANA_V4/PRAMANA_Lineage_Dossier.docx
@@ -293,6 +293,17 @@
           <w:sz w:val="19"/>
         </w:rPr>
         <w:t>사전등록 kill — 결과 본 뒤 goalpost 이동 금지(= config-mining 금지)</w:t>
+      </w:r>
+    </w:p>
+    <w:p>
+      <w:pPr>
+        <w:pStyle w:val="ListBullet"/>
+      </w:pPr>
+      <w:r>
+        <w:rPr>
+          <w:sz w:val="19"/>
+        </w:rPr>
+        <w:t>Macro Emergency Override — 위기 확정 시(QQQ 200일선 하회·고점 −25%·VIX 급등·breadth 붕괴·credit·연속 gap-down) *공격 파트만*(레버·V8 shadow·Alpha Lab 신규 risk-on) 차단 + 사람 리뷰 트리거. **코어 4-sleeve 1.0x는 면역**(자동 코어전환 아님 = regime-switch/throttle 기각 교훈)·후행이라 첫 −25%는 못 피함(예측 아니라 *추가 위험 차단 + 사람 게이트*)</w:t>
       </w:r>
     </w:p>
     <w:p>
@@ -622,6 +633,50 @@
           <w:sz w:val="19"/>
         </w:rPr>
         <w:t>결제 판단(불변 기준): ① v2가 무가치면 유료 보류 ② 후보는 잡히나 체결·스프레드·기간 제약으로 판단불가면 1개월 파일럿 ③ 목적 = '알파 구매'가 아니라 '데이터 병목 제거'.</w:t>
+      </w:r>
+    </w:p>
+    <w:p>
+      <w:r>
+        <w:rPr>
+          <w:b/>
+          <w:i w:val="0"/>
+          <w:color w:val="2E5496"/>
+          <w:sz w:val="20"/>
+        </w:rPr>
+        <w:t>E. 위기 데이터 처리 (불변)</w:t>
+      </w:r>
+    </w:p>
+    <w:p>
+      <w:pPr>
+        <w:pStyle w:val="ListBullet"/>
+      </w:pPr>
+      <w:r>
+        <w:rPr>
+          <w:sz w:val="19"/>
+        </w:rPr>
+        <w:t>닷컴(2000-02)·2008 같은 큰 위기 = 학습/파라미터 튜닝엔 *제외 또는 별도 분리*(과최적화 노이즈)·promotion stress 검증엔 **필수 포함**.</w:t>
+      </w:r>
+    </w:p>
+    <w:p>
+      <w:pPr>
+        <w:pStyle w:val="ListBullet"/>
+      </w:pPr>
+      <w:r>
+        <w:rPr>
+          <w:sz w:val="19"/>
+        </w:rPr>
+        <w:t>'사람이 알아차리고 뺄 수 있다'는 가정 금지 — 위기는 실시간엔 단순 조정처럼 오고 −20/−30% 후에야 확정. 회피는 감이 아니라 Macro Emergency Override(시스템화·위 B)로만 인정.</w:t>
+      </w:r>
+    </w:p>
+    <w:p>
+      <w:pPr>
+        <w:pStyle w:val="ListBullet"/>
+      </w:pPr>
+      <w:r>
+        <w:rPr>
+          <w:sz w:val="19"/>
+        </w:rPr>
+        <w:t>장기 stress proxy 한계 명시(2000 managed-futures sleeve = cash 부재 → 4-sleeve에 불리)·'닷컴 때문에 전부 폐기'도 '닷컴 무시 통과'도 금지 → UNKNOWN 라벨.</w:t>
       </w:r>
     </w:p>
     <w:p>
@@ -1069,7 +1124,7 @@
         <w:rPr>
           <w:sz w:val="19"/>
         </w:rPr>
-        <w:t>QQQ bull 수익 ~절반 포기(목적함수 선택) · throttle 기각(crash-pack서 static 4-sleeve 못 이김) · Alpha Lab v1 setup DEAD(RVOL 누수·강세장 베타) · forward 0개월 · DBMF/GLD 짧은 역사</w:t>
+        <w:t>QQQ bull 수익 ~절반 포기(목적함수 선택) · throttle 기각(crash-pack서 static 4-sleeve 못 이김) · Alpha Lab v1 setup DEAD(RVOL 누수·강세장 베타) · forward 0개월 · DBMF/GLD 짧은 역사 · ★ 닷컴류 stress: 2019~ MDD −18%는 *benign 샘플*(닷컴/2008 없음)·진짜 닷컴류엔 V7 1.0x도 −39%(2000 MF proxy 부재로 보수적·불완전)</w:t>
       </w:r>
     </w:p>
     <w:p>
@@ -1090,7 +1145,92 @@
           <w:i w:val="0"/>
           <w:sz w:val="19"/>
         </w:rPr>
-        <w:t>→ 왜 다음으로: (현재) forward 12개월 관찰 + Alpha Lab event-driven paper 로그</w:t>
+        <w:t>→ 왜 다음으로: (현재) forward 12개월 관찰 + Alpha Lab event-driven paper 로그·닷컴 caveat 추가</w:t>
+      </w:r>
+    </w:p>
+    <w:p>
+      <w:pPr>
+        <w:pStyle w:val="Heading2"/>
+      </w:pPr>
+      <w:r>
+        <w:rPr>
+          <w:color w:val="2E5496"/>
+        </w:rPr>
+        <w:t>V8 Candidate — Levered 4-sleeve (UNKNOWN · RESEARCH_ONLY · shadow only)</w:t>
+      </w:r>
+    </w:p>
+    <w:p>
+      <w:r>
+        <w:rPr>
+          <w:b/>
+          <w:i w:val="0"/>
+          <w:color w:val="C55A11"/>
+          <w:sz w:val="20"/>
+        </w:rPr>
+        <w:t>V7 분산북을 조심스럽게 레버(1.10~1.25x) · 자본권한 0 · 알파 아님</w:t>
+      </w:r>
+    </w:p>
+    <w:p>
+      <w:r>
+        <w:rPr>
+          <w:b/>
+          <w:i w:val="0"/>
+          <w:sz w:val="19"/>
+        </w:rPr>
+        <w:t>결과물:</w:t>
+      </w:r>
+    </w:p>
+    <w:p>
+      <w:pPr>
+        <w:pStyle w:val="ListBullet"/>
+      </w:pPr>
+      <w:r>
+        <w:rPr>
+          <w:sz w:val="19"/>
+        </w:rPr>
+        <w:t>v8_levered_crashpack.py(grid crash-pack 1.0~1.5x) · V8_Candidate_Levered4sleeve_Protocol.md</w:t>
+      </w:r>
+    </w:p>
+    <w:p>
+      <w:r>
+        <w:rPr>
+          <w:b/>
+          <w:i w:val="0"/>
+          <w:sz w:val="19"/>
+        </w:rPr>
+        <w:t>문제점/한계:</w:t>
+      </w:r>
+    </w:p>
+    <w:p>
+      <w:pPr>
+        <w:pStyle w:val="ListBullet"/>
+      </w:pPr>
+      <w:r>
+        <w:rPr>
+          <w:sz w:val="19"/>
+        </w:rPr>
+        <w:t>알파 아님 = 분산 프리미엄 레버 = 목적함수 이동(상승참여↑·하락방어) · 닷컴 proxy서 1.25x −49%(단 2000 MF=cash 부재) vs 2008 −32% 통과 = **UNKNOWN** · 1.35x/1.5x 폐기(2008서도 −35%) · forward 레버 꼬리(V5 −70% 교훈)</w:t>
+      </w:r>
+    </w:p>
+    <w:p>
+      <w:r>
+        <w:rPr>
+          <w:b w:val="0"/>
+          <w:i w:val="0"/>
+          <w:color w:val="C00000"/>
+          <w:sz w:val="19"/>
+        </w:rPr>
+        <w:t>트러블슈팅: Codex가 equity proxy 결함(VFINX≠SPY/QQQ·QQQ 닷컴 −78% 누락) 잡음 → 실 SPY/QQQ로 수정 → 판정 UNKNOWN(전멸도 통과도 아님)</w:t>
+      </w:r>
+    </w:p>
+    <w:p>
+      <w:r>
+        <w:rPr>
+          <w:b/>
+          <w:i w:val="0"/>
+          <w:sz w:val="19"/>
+        </w:rPr>
+        <w:t>→ 왜 다음으로: 1.10~1.25x 자본0 shadow forward로 'UNKNOWN 추적'(승격도 폐기도 아님)·실자본 금지·옵션 컨벡시티는 나중 후보</w:t>
       </w:r>
     </w:p>
     <w:p>
@@ -2933,7 +3073,7 @@
           <w:color w:val="2E5496"/>
           <w:sz w:val="20"/>
         </w:rPr>
-        <w:t>Track 1 — Core Forward</w:t>
+        <w:t>Track 1 — Core Forward + V8 shadow</w:t>
       </w:r>
     </w:p>
     <w:p>
@@ -2944,7 +3084,7 @@
         <w:rPr>
           <w:sz w:val="19"/>
         </w:rPr>
-        <w:t>순수 4-sleeve(V7) 12개월 paper forward: QQQ·60/40 대비 누적/MDD/회복기간/Sharpe·위기구간 방어.</w:t>
+        <w:t>순수 4-sleeve(V7) 1.0x 12개월 paper forward: QQQ·60/40 대비 누적/MDD/회복/Sharpe·위기방어. 절대 건드리지 말 것: LETF·throttle·core switching(기각됨).</w:t>
       </w:r>
     </w:p>
     <w:p>
@@ -2955,7 +3095,7 @@
         <w:rPr>
           <w:sz w:val="19"/>
         </w:rPr>
-        <w:t>절대 건드리지 말 것: LETF · throttle · core switching (전부 데이터로 기각됨).</w:t>
+        <w:t>V8 Candidate 1.10~1.25x = 자본0 shadow forward로 'UNKNOWN 추적'(승격도 폐기도 아님·코어 1.0x와 분리·1.35x+ 폐기).</w:t>
       </w:r>
     </w:p>
     <w:p>
@@ -2966,7 +3106,7 @@
           <w:color w:val="2E5496"/>
           <w:sz w:val="20"/>
         </w:rPr>
-        <w:t>Track 2 — Alpha Lab 관찰</w:t>
+        <w:t>Track 2 — Alpha Lab + LLM catalyst</w:t>
       </w:r>
     </w:p>
     <w:p>
@@ -2977,7 +3117,29 @@
         <w:rPr>
           <w:sz w:val="19"/>
         </w:rPr>
-        <w:t>v1 = DEAD 기록 + 원형 forward 관찰(폐기 안 함) · v2 = event-driven momentum forward 로그 · 튜닝 금지 · 4~8주 후 후보 품질 평가.</w:t>
+        <w:t>v1 = DEAD 기록 + 원형 forward 관찰 · v2 = event-driven momentum forward 로그 · 튜닝 금지.</w:t>
+      </w:r>
+    </w:p>
+    <w:p>
+      <w:pPr>
+        <w:pStyle w:val="ListBullet"/>
+      </w:pPr>
+      <w:r>
+        <w:rPr>
+          <w:sz w:val="19"/>
+        </w:rPr>
+        <w:t>LLM catalyst 분류 1회 = v2 후보를 실제 뉴스로 A/B/C/D 재분류(proxy C급이 진짜 이유 없는지·매수결정권 0)·또 테마베타면 Alpha Lab 저우선 강등.</w:t>
+      </w:r>
+    </w:p>
+    <w:p>
+      <w:pPr>
+        <w:pStyle w:val="ListBullet"/>
+      </w:pPr>
+      <w:r>
+        <w:rPr>
+          <w:sz w:val="19"/>
+        </w:rPr>
+        <w:t>TSFM/Chronos = *나중* meta-labeler challenger(off-path·내일수익 예측 X·setup 메타라벨/tail-risk 후보·얕은 모델보다 OOS 비용후 좋아야 유지).</w:t>
       </w:r>
     </w:p>
     <w:p>
@@ -3053,7 +3215,18 @@
           <w:i/>
           <w:sz w:val="19"/>
         </w:rPr>
-        <w:t>계보: v1~v3 단순팩터(SPY 못 이김·파이프 검증) → V4 베타북 → V5 레버(같이 낙폭) → V6 분산(보험료) → V7 4-sleeve(크래시 생존 선택) + Alpha Lab(급등주 paper 관찰).</w:t>
+        <w:t>계보: v1~v3 단순팩터(SPY 못 이김·파이프 검증) → V4 베타북 → V5 레버(같이 낙폭) → V6 분산(보험료) → V7 4-sleeve(크래시 생존 선택) + Alpha Lab(급등주 paper 관찰) → V8 Candidate(분산북 레버·UNKNOWN shadow).</w:t>
+      </w:r>
+    </w:p>
+    <w:p>
+      <w:r>
+        <w:rPr>
+          <w:b/>
+          <w:i w:val="0"/>
+          <w:color w:val="C55A11"/>
+          <w:sz w:val="19"/>
+        </w:rPr>
+        <w:t>정합(2026-06-12): 닷컴은 학습 노이즈로 제외 가능하나 *리스크 검증 제외 금지*(감 아니라 Macro Emergency Override로 시스템화) · V8은 확정도 폐기도 아닌 UNKNOWN shadow · V7은 닷컴 caveat(−39%) 추가 · 알파는 LLM catalyst 붙인 Alpha Lab에서 계속.</w:t>
       </w:r>
     </w:p>
     <w:sectPr>

</xml_diff>